<commit_message>
docs(begroting): RvB-verantwoording inhoudelijk onderbouwd en mijlpaal realistisch (go-live 2028)
</commit_message>
<xml_diff>
--- a/Begroting/Verantwoording RvB 2027 - Klant in zicht.docx
+++ b/Begroting/Verantwoording RvB 2027 - Klant in zicht.docx
@@ -73,7 +73,7 @@
           <w:sz w:val="22"/>
           <w:szCs w:val="22"/>
         </w:rPr>
-        <w:t xml:space="preserve">2027 is het realisatiejaar: de bouw van het cross-sectorale CRM-klantdashboard met de eerste bronsysteemintegraties (€ 197.000), het eerste trainingsblok gespreksvaardigheid voor ± 80 medewerkers (€ 39.500) en de verdere verankering van leiderschap en klantprocessen (€ 58.000, plus € 7.000 onvoorzien). Totaal </w:t>
+        <w:t xml:space="preserve">In 2027 gaat het programma van voorbereiding naar realisatie. Het cross-sectorale CRM-klantdashboard wordt gebouwd en aan de eerste bronsystemen gekoppeld (€ 197.000) — het fundament voor een integraal klantbeeld — en het eerste trainingsblok gespreksvaardigheid (± 80 medewerkers, € 39.500) brengt de klantgerichte werkwijze in het dagelijkse gedrag. Systeem en gedrag versterken elkaar en zijn daarom bewust in hetzelfde jaar gepland; de verankering van leiderschap en klantprocessen (€ 58.000, plus € 7.000 onvoorzien dat bij niet-gebruik terugvalt aan het programmabudget) borgt dat beide beklijven. Totaal </w:t>
       </w:r>
       <w:r>
         <w:rPr>
@@ -93,7 +93,7 @@
           <w:sz w:val="22"/>
           <w:szCs w:val="22"/>
         </w:rPr>
-        <w:t xml:space="preserve">. Alle bedragen zijn herleidbaar naar marktbenchmarks en de onderliggende programmadata.</w:t>
+        <w:t xml:space="preserve">, herleidbaar naar marktbenchmarks en de onderliggende programmadata.</w:t>
       </w:r>
     </w:p>
     <w:p>
@@ -141,7 +141,7 @@
           <w:sz w:val="22"/>
           <w:szCs w:val="22"/>
         </w:rPr>
-        <w:t xml:space="preserve">Mijlpaal eind 2027: alle sectoren werken actief met het nieuwe klantbeeld en het programma draait zelfstandig in de lijnorganisatie.</w:t>
+        <w:t xml:space="preserve">Mijlpaal eind 2027: het eerste trainingsblok is afgerond, de CRM-bouw met de eerste integraties staat (go-live volgt in 2028) en de sectoren werken steeds meer zelfstandig met het nieuwe klantbeeld.</w:t>
       </w:r>
     </w:p>
     <w:p>

</xml_diff>